<commit_message>
feat(state): Add values to FSM states enum
</commit_message>
<xml_diff>
--- a/asd.docx
+++ b/asd.docx
@@ -524,42 +524,42 @@
           <w:lang w:val="ru-RU"/>
         </w:rPr>
       </w:pPr>
-      <w:r>
-        <w:rPr>
-          <w:rFonts w:hint="default"/>
-          <w:lang w:val="ru-RU"/>
-        </w:rPr>
-        <w:br w:type="textWrapping"/>
-      </w:r>
-      <w:r>
-        <w:rPr>
-          <w:rFonts w:hint="default"/>
-          <w:lang w:val="ru-RU"/>
-        </w:rPr>
-        <w:t xml:space="preserve">Для отчёта нужен </w:t>
+    </w:p>
+    <w:p>
+      <w:pPr>
+        <w:rPr>
+          <w:rFonts w:hint="default"/>
+          <w:lang w:val="ru-RU"/>
+        </w:rPr>
+      </w:pPr>
+      <w:r>
+        <w:rPr>
+          <w:rFonts w:hint="default"/>
+          <w:lang w:val="ru-RU"/>
+        </w:rPr>
+        <w:t xml:space="preserve">Таблица состояний </w:t>
       </w:r>
       <w:r>
         <w:rPr>
           <w:rFonts w:hint="default"/>
           <w:lang w:val="en-US"/>
         </w:rPr>
-        <w:t xml:space="preserve">trace </w:t>
-      </w:r>
-      <w:r>
-        <w:rPr>
-          <w:rFonts w:hint="default"/>
-          <w:lang w:val="ru-RU"/>
-        </w:rPr>
-        <w:t>со светодиодами датчиками и скоростью но одновременно нельзя больше 8 поэтому сначала светодиоды + датчики</w:t>
-      </w:r>
-    </w:p>
-    <w:p>
+        <w:t>enum</w:t>
+      </w:r>
+    </w:p>
+    <w:p>
+      <w:pPr>
+        <w:rPr>
+          <w:rFonts w:hint="default"/>
+          <w:lang w:val="en-US"/>
+        </w:rPr>
+      </w:pPr>
       <w:r>
         <w:drawing>
           <wp:inline distT="0" distB="0" distL="114300" distR="114300">
-            <wp:extent cx="5267960" cy="2563495"/>
-            <wp:effectExtent l="0" t="0" r="8890" b="8255"/>
-            <wp:docPr id="11" name="Изображение 9"/>
+            <wp:extent cx="5270500" cy="1447800"/>
+            <wp:effectExtent l="0" t="0" r="6350" b="0"/>
+            <wp:docPr id="2" name="Изображение 2"/>
             <wp:cNvGraphicFramePr>
               <a:graphicFrameLocks xmlns:a="http://schemas.openxmlformats.org/drawingml/2006/main" noChangeAspect="1"/>
             </wp:cNvGraphicFramePr>
@@ -567,7 +567,7 @@
               <a:graphicData uri="http://schemas.openxmlformats.org/drawingml/2006/picture">
                 <pic:pic xmlns:pic="http://schemas.openxmlformats.org/drawingml/2006/picture">
                   <pic:nvPicPr>
-                    <pic:cNvPr id="11" name="Изображение 9"/>
+                    <pic:cNvPr id="2" name="Изображение 2"/>
                     <pic:cNvPicPr>
                       <a:picLocks noChangeAspect="1"/>
                     </pic:cNvPicPr>
@@ -581,7 +581,7 @@
                   <pic:spPr>
                     <a:xfrm>
                       <a:off x="0" y="0"/>
-                      <a:ext cx="5267960" cy="2563495"/>
+                      <a:ext cx="5270500" cy="1447800"/>
                     </a:xfrm>
                     <a:prstGeom prst="rect">
                       <a:avLst/>
@@ -601,11 +601,80 @@
     <w:p>
       <w:pPr>
         <w:rPr>
-          <w:lang w:val="ru-RU"/>
-        </w:rPr>
-      </w:pPr>
-      <w:r>
-        <w:rPr>
+          <w:rFonts w:hint="default"/>
+          <w:lang w:val="ru-RU"/>
+        </w:rPr>
+      </w:pPr>
+    </w:p>
+    <w:p>
+      <w:pPr>
+        <w:rPr>
+          <w:rFonts w:hint="default"/>
+          <w:lang w:val="ru-RU"/>
+        </w:rPr>
+      </w:pPr>
+      <w:r>
+        <w:rPr>
+          <w:rFonts w:hint="default"/>
+          <w:lang w:val="ru-RU"/>
+        </w:rPr>
+        <w:br w:type="textWrapping"/>
+      </w:r>
+      <w:r>
+        <w:rPr>
+          <w:rFonts w:hint="default"/>
+          <w:lang w:val="ru-RU"/>
+        </w:rPr>
+        <w:t xml:space="preserve">Для отчёта нужен </w:t>
+      </w:r>
+      <w:r>
+        <w:rPr>
+          <w:rFonts w:hint="default"/>
+          <w:lang w:val="en-US"/>
+        </w:rPr>
+        <w:t xml:space="preserve">trace </w:t>
+      </w:r>
+      <w:r>
+        <w:rPr>
+          <w:rFonts w:hint="default"/>
+          <w:lang w:val="ru-RU"/>
+        </w:rPr>
+        <w:t xml:space="preserve">со светодиодами датчиками и скоростью но одновременно нельзя </w:t>
+      </w:r>
+    </w:p>
+    <w:p>
+      <w:pPr>
+        <w:rPr>
+          <w:rFonts w:hint="default"/>
+          <w:lang w:val="ru-RU"/>
+        </w:rPr>
+      </w:pPr>
+      <w:r>
+        <w:rPr>
+          <w:rFonts w:hint="default"/>
+          <w:lang w:val="ru-RU"/>
+        </w:rPr>
+        <w:t xml:space="preserve">больше 8 поэтому сначала </w:t>
+      </w:r>
+    </w:p>
+    <w:p>
+      <w:pPr>
+        <w:rPr>
+          <w:rFonts w:hint="default"/>
+          <w:lang w:val="ru-RU"/>
+        </w:rPr>
+      </w:pPr>
+    </w:p>
+    <w:p>
+      <w:pPr>
+        <w:rPr>
+          <w:rFonts w:hint="default"/>
+          <w:lang w:val="ru-RU"/>
+        </w:rPr>
+      </w:pPr>
+      <w:r>
+        <w:rPr>
+          <w:rFonts w:hint="default"/>
           <w:lang w:val="ru-RU"/>
         </w:rPr>
         <w:br w:type="page"/>
@@ -615,38 +684,31 @@
       <w:pPr>
         <w:rPr>
           <w:rFonts w:hint="default"/>
-          <w:lang w:val="ru-RU"/>
-        </w:rPr>
-      </w:pPr>
-      <w:bookmarkStart w:id="0" w:name="_GoBack"/>
-      <w:bookmarkEnd w:id="0"/>
-      <w:r>
-        <w:rPr>
-          <w:lang w:val="ru-RU"/>
-        </w:rPr>
-        <w:t>Зависимость</w:t>
-      </w:r>
-      <w:r>
-        <w:rPr>
-          <w:rFonts w:hint="default"/>
-          <w:lang w:val="ru-RU"/>
-        </w:rPr>
-        <w:t xml:space="preserve"> скорости от датчиков и датчика направления</w:t>
-      </w:r>
-    </w:p>
-    <w:p>
-      <w:pPr>
-        <w:rPr>
-          <w:rFonts w:hint="default"/>
-          <w:lang w:val="ru-RU"/>
-        </w:rPr>
-      </w:pPr>
+          <w:lang w:val="en-US"/>
+        </w:rPr>
+      </w:pPr>
+      <w:r>
+        <w:rPr>
+          <w:rFonts w:hint="default"/>
+          <w:lang w:val="ru-RU"/>
+        </w:rPr>
+        <w:t xml:space="preserve">Исследование режима </w:t>
+      </w:r>
+      <w:r>
+        <w:rPr>
+          <w:rFonts w:hint="default"/>
+          <w:lang w:val="en-US"/>
+        </w:rPr>
+        <w:t>INIT</w:t>
+      </w:r>
+    </w:p>
+    <w:p>
       <w:r>
         <w:drawing>
           <wp:inline distT="0" distB="0" distL="114300" distR="114300">
-            <wp:extent cx="5269865" cy="2509520"/>
-            <wp:effectExtent l="0" t="0" r="6985" b="5080"/>
-            <wp:docPr id="12" name="Изображение 10"/>
+            <wp:extent cx="5270500" cy="4461510"/>
+            <wp:effectExtent l="0" t="0" r="6350" b="15240"/>
+            <wp:docPr id="1" name="Изображение 1"/>
             <wp:cNvGraphicFramePr>
               <a:graphicFrameLocks xmlns:a="http://schemas.openxmlformats.org/drawingml/2006/main" noChangeAspect="1"/>
             </wp:cNvGraphicFramePr>
@@ -654,7 +716,7 @@
               <a:graphicData uri="http://schemas.openxmlformats.org/drawingml/2006/picture">
                 <pic:pic xmlns:pic="http://schemas.openxmlformats.org/drawingml/2006/picture">
                   <pic:nvPicPr>
-                    <pic:cNvPr id="12" name="Изображение 10"/>
+                    <pic:cNvPr id="1" name="Изображение 1"/>
                     <pic:cNvPicPr>
                       <a:picLocks noChangeAspect="1"/>
                     </pic:cNvPicPr>
@@ -668,7 +730,254 @@
                   <pic:spPr>
                     <a:xfrm>
                       <a:off x="0" y="0"/>
-                      <a:ext cx="5269865" cy="2509520"/>
+                      <a:ext cx="5270500" cy="4461510"/>
+                    </a:xfrm>
+                    <a:prstGeom prst="rect">
+                      <a:avLst/>
+                    </a:prstGeom>
+                    <a:noFill/>
+                    <a:ln>
+                      <a:noFill/>
+                    </a:ln>
+                  </pic:spPr>
+                </pic:pic>
+              </a:graphicData>
+            </a:graphic>
+          </wp:inline>
+        </w:drawing>
+      </w:r>
+    </w:p>
+    <w:p>
+      <w:pPr>
+        <w:rPr>
+          <w:rFonts w:hint="default"/>
+          <w:lang w:val="ru-RU"/>
+        </w:rPr>
+      </w:pPr>
+      <w:r>
+        <w:rPr>
+          <w:rFonts w:hint="default"/>
+          <w:lang w:val="ru-RU"/>
+        </w:rPr>
+        <w:t xml:space="preserve">Как видно из рисунка на протяжении всего теста состояние </w:t>
+      </w:r>
+      <w:r>
+        <w:rPr>
+          <w:rFonts w:hint="default"/>
+          <w:lang w:val="en-US"/>
+        </w:rPr>
+        <w:t xml:space="preserve">ST_UNKNOWN, </w:t>
+      </w:r>
+      <w:r>
+        <w:rPr>
+          <w:rFonts w:hint="default"/>
+          <w:lang w:val="ru-RU"/>
+        </w:rPr>
+        <w:t xml:space="preserve">что видно из графика </w:t>
+      </w:r>
+      <w:r>
+        <w:rPr>
+          <w:rFonts w:hint="default"/>
+          <w:lang w:val="en-US"/>
+        </w:rPr>
+        <w:t xml:space="preserve">doorSM.state </w:t>
+      </w:r>
+      <w:r>
+        <w:rPr>
+          <w:rFonts w:hint="default"/>
+          <w:lang w:val="ru-RU"/>
+        </w:rPr>
+        <w:t>который равен единце</w:t>
+      </w:r>
+    </w:p>
+    <w:p>
+      <w:pPr>
+        <w:rPr>
+          <w:rFonts w:hint="default"/>
+          <w:lang w:val="ru-RU"/>
+        </w:rPr>
+      </w:pPr>
+    </w:p>
+    <w:p>
+      <w:pPr>
+        <w:rPr>
+          <w:rFonts w:hint="default"/>
+          <w:lang w:val="ru-RU"/>
+        </w:rPr>
+      </w:pPr>
+      <w:r>
+        <w:rPr>
+          <w:rFonts w:hint="default"/>
+          <w:lang w:val="ru-RU"/>
+        </w:rPr>
+        <w:t>светодиоды + датчики</w:t>
+      </w:r>
+    </w:p>
+    <w:p>
+      <w:r>
+        <w:drawing>
+          <wp:inline distT="0" distB="0" distL="114300" distR="114300">
+            <wp:extent cx="5262880" cy="2957195"/>
+            <wp:effectExtent l="0" t="0" r="13970" b="14605"/>
+            <wp:docPr id="13" name="Изображение 4"/>
+            <wp:cNvGraphicFramePr>
+              <a:graphicFrameLocks xmlns:a="http://schemas.openxmlformats.org/drawingml/2006/main" noChangeAspect="1"/>
+            </wp:cNvGraphicFramePr>
+            <a:graphic xmlns:a="http://schemas.openxmlformats.org/drawingml/2006/main">
+              <a:graphicData uri="http://schemas.openxmlformats.org/drawingml/2006/picture">
+                <pic:pic xmlns:pic="http://schemas.openxmlformats.org/drawingml/2006/picture">
+                  <pic:nvPicPr>
+                    <pic:cNvPr id="13" name="Изображение 4"/>
+                    <pic:cNvPicPr>
+                      <a:picLocks noChangeAspect="1"/>
+                    </pic:cNvPicPr>
+                  </pic:nvPicPr>
+                  <pic:blipFill>
+                    <a:blip r:embed="rId14"/>
+                    <a:stretch>
+                      <a:fillRect/>
+                    </a:stretch>
+                  </pic:blipFill>
+                  <pic:spPr>
+                    <a:xfrm>
+                      <a:off x="0" y="0"/>
+                      <a:ext cx="5262880" cy="2957195"/>
+                    </a:xfrm>
+                    <a:prstGeom prst="rect">
+                      <a:avLst/>
+                    </a:prstGeom>
+                    <a:noFill/>
+                    <a:ln>
+                      <a:noFill/>
+                    </a:ln>
+                  </pic:spPr>
+                </pic:pic>
+              </a:graphicData>
+            </a:graphic>
+          </wp:inline>
+        </w:drawing>
+      </w:r>
+    </w:p>
+    <w:p>
+      <w:pPr>
+        <w:rPr>
+          <w:rFonts w:hint="default"/>
+          <w:lang w:val="ru-RU"/>
+        </w:rPr>
+      </w:pPr>
+      <w:r>
+        <w:rPr>
+          <w:lang w:val="ru-RU"/>
+        </w:rPr>
+        <w:t>Видно</w:t>
+      </w:r>
+      <w:r>
+        <w:rPr>
+          <w:rFonts w:hint="default"/>
+          <w:lang w:val="ru-RU"/>
+        </w:rPr>
+        <w:t xml:space="preserve"> как в зависимости от кнопок блаблабла дирекшн не указан но сначала сделали его влево чтобы ворота стали «опен» потом начали их закрывать и обратно открывать</w:t>
+      </w:r>
+      <w:bookmarkStart w:id="0" w:name="_GoBack"/>
+      <w:bookmarkEnd w:id="0"/>
+      <w:r>
+        <w:rPr>
+          <w:rFonts w:hint="default"/>
+          <w:lang w:val="ru-RU"/>
+        </w:rPr>
+        <w:br w:type="textWrapping"/>
+      </w:r>
+      <w:r>
+        <w:rPr>
+          <w:rFonts w:hint="default"/>
+          <w:lang w:val="ru-RU"/>
+        </w:rPr>
+        <w:t>Видно мерцание и тд</w:t>
+      </w:r>
+    </w:p>
+    <w:p>
+      <w:pPr>
+        <w:rPr>
+          <w:lang w:val="ru-RU"/>
+        </w:rPr>
+      </w:pPr>
+      <w:r>
+        <w:rPr>
+          <w:lang w:val="ru-RU"/>
+        </w:rPr>
+        <w:br w:type="page"/>
+      </w:r>
+    </w:p>
+    <w:p>
+      <w:pPr>
+        <w:rPr>
+          <w:rFonts w:hint="default"/>
+          <w:lang w:val="ru-RU"/>
+        </w:rPr>
+      </w:pPr>
+      <w:r>
+        <w:rPr>
+          <w:lang w:val="ru-RU"/>
+        </w:rPr>
+        <w:t>Зависимость</w:t>
+      </w:r>
+      <w:r>
+        <w:rPr>
+          <w:rFonts w:hint="default"/>
+          <w:lang w:val="ru-RU"/>
+        </w:rPr>
+        <w:t xml:space="preserve"> скорости</w:t>
+      </w:r>
+      <w:r>
+        <w:rPr>
+          <w:rFonts w:hint="default"/>
+          <w:lang w:val="en-US"/>
+        </w:rPr>
+        <w:t xml:space="preserve"> </w:t>
+      </w:r>
+      <w:r>
+        <w:rPr>
+          <w:rFonts w:hint="default"/>
+          <w:lang w:val="ru-RU"/>
+        </w:rPr>
+        <w:t>и состояния автомата от датчиков и датчика направления</w:t>
+      </w:r>
+    </w:p>
+    <w:p>
+      <w:pPr>
+        <w:rPr>
+          <w:rFonts w:hint="default"/>
+          <w:lang w:val="ru-RU"/>
+        </w:rPr>
+      </w:pPr>
+      <w:r>
+        <w:drawing>
+          <wp:inline distT="0" distB="0" distL="114300" distR="114300">
+            <wp:extent cx="5264150" cy="3051810"/>
+            <wp:effectExtent l="0" t="0" r="12700" b="15240"/>
+            <wp:docPr id="12" name="Изображение 3"/>
+            <wp:cNvGraphicFramePr>
+              <a:graphicFrameLocks xmlns:a="http://schemas.openxmlformats.org/drawingml/2006/main" noChangeAspect="1"/>
+            </wp:cNvGraphicFramePr>
+            <a:graphic xmlns:a="http://schemas.openxmlformats.org/drawingml/2006/main">
+              <a:graphicData uri="http://schemas.openxmlformats.org/drawingml/2006/picture">
+                <pic:pic xmlns:pic="http://schemas.openxmlformats.org/drawingml/2006/picture">
+                  <pic:nvPicPr>
+                    <pic:cNvPr id="12" name="Изображение 3"/>
+                    <pic:cNvPicPr>
+                      <a:picLocks noChangeAspect="1"/>
+                    </pic:cNvPicPr>
+                  </pic:nvPicPr>
+                  <pic:blipFill>
+                    <a:blip r:embed="rId15"/>
+                    <a:stretch>
+                      <a:fillRect/>
+                    </a:stretch>
+                  </pic:blipFill>
+                  <pic:spPr>
+                    <a:xfrm>
+                      <a:off x="0" y="0"/>
+                      <a:ext cx="5264150" cy="3051810"/>
                     </a:xfrm>
                     <a:prstGeom prst="rect">
                       <a:avLst/>

</xml_diff>